<commit_message>
report for lab 5
</commit_message>
<xml_diff>
--- a/labs/lab05/report/Л05_Гасанова_отчет.docx
+++ b/labs/lab05/report/Л05_Гасанова_отчет.docx
@@ -757,6 +757,15 @@
       </w:r>
       <w:r>
         <w:t xml:space="preserve">@fig:009</w:t>
+      </w:r>
+      <w:r>
+        <w:t xml:space="preserve">, рис.</w:t>
+      </w:r>
+      <w:r>
+        <w:t xml:space="preserve"> </w:t>
+      </w:r>
+      <w:r>
+        <w:t xml:space="preserve">@fig:010</w:t>
       </w:r>
       <w:r>
         <w:t xml:space="preserve">).</w:t>

</xml_diff>